<commit_message>
nmv 08 09 2026
</commit_message>
<xml_diff>
--- a/TS Jatai Ghanam Project/TS 3.4/TS 3.4 Jatai Malayalam Corrections.docx
+++ b/TS Jatai Ghanam Project/TS 3.4/TS 3.4 Jatai Malayalam Corrections.docx
@@ -1,6 +1,6 @@
 
 <file path=word/document.xml><?xml version="1.0" encoding="utf-8"?>
-<w:document xmlns:wpc="http://schemas.microsoft.com/office/word/2010/wordprocessingCanvas" xmlns:cx="http://schemas.microsoft.com/office/drawing/2014/chartex" xmlns:cx1="http://schemas.microsoft.com/office/drawing/2015/9/8/chartex" xmlns:cx2="http://schemas.microsoft.com/office/drawing/2015/10/21/chartex" xmlns:cx3="http://schemas.microsoft.com/office/drawing/2016/5/9/chartex" xmlns:cx4="http://schemas.microsoft.com/office/drawing/2016/5/10/chartex" xmlns:cx5="http://schemas.microsoft.com/office/drawing/2016/5/11/chartex" xmlns:cx6="http://schemas.microsoft.com/office/drawing/2016/5/12/chartex" xmlns:cx7="http://schemas.microsoft.com/office/drawing/2016/5/13/chartex" xmlns:cx8="http://schemas.microsoft.com/office/drawing/2016/5/14/chartex" xmlns:mc="http://schemas.openxmlformats.org/markup-compatibility/2006" xmlns:aink="http://schemas.microsoft.com/office/drawing/2016/ink" xmlns:am3d="http://schemas.microsoft.com/office/drawing/2017/model3d" xmlns:o="urn:schemas-microsoft-com:office:office" xmlns:oel="http://schemas.microsoft.com/office/2019/extlst" xmlns:r="http://schemas.openxmlformats.org/officeDocument/2006/relationships" xmlns:m="http://schemas.openxmlformats.org/officeDocument/2006/math" xmlns:v="urn:schemas-microsoft-com:vml" xmlns:wp14="http://schemas.microsoft.com/office/word/2010/wordprocessingDrawing" xmlns:wp="http://schemas.openxmlformats.org/drawingml/2006/wordprocessingDrawing" xmlns:w10="urn:schemas-microsoft-com:office:word" xmlns:w="http://schemas.openxmlformats.org/wordprocessingml/2006/main" xmlns:w14="http://schemas.microsoft.com/office/word/2010/wordml" xmlns:w15="http://schemas.microsoft.com/office/word/2012/wordml" xmlns:w16cei="http://schemas.microsoft.com/office/word/2026/wordml/cei" xmlns:w16cex="http://schemas.microsoft.com/office/word/2018/wordml/cex" xmlns:w16cid="http://schemas.microsoft.com/office/word/2016/wordml/cid" xmlns:w16="http://schemas.microsoft.com/office/word/2018/wordml" xmlns:w16du="http://schemas.microsoft.com/office/word/2023/wordml/word16du" xmlns:w16sdtdh="http://schemas.microsoft.com/office/word/2020/wordml/sdtdatahash" xmlns:w16sdtfl="http://schemas.microsoft.com/office/word/2024/wordml/sdtformatlock" xmlns:w16se="http://schemas.microsoft.com/office/word/2015/wordml/symex" xmlns:wpg="http://schemas.microsoft.com/office/word/2010/wordprocessingGroup" xmlns:wpi="http://schemas.microsoft.com/office/word/2010/wordprocessingInk" xmlns:wne="http://schemas.microsoft.com/office/word/2006/wordml" xmlns:wps="http://schemas.microsoft.com/office/word/2010/wordprocessingShape" mc:Ignorable="w14 w15 w16se w16cid w16 w16cex w16sdtdh w16sdtfl w16du wp14">
+<w:document xmlns:wpc="http://schemas.microsoft.com/office/word/2010/wordprocessingCanvas" xmlns:cx="http://schemas.microsoft.com/office/drawing/2014/chartex" xmlns:cx1="http://schemas.microsoft.com/office/drawing/2015/9/8/chartex" xmlns:cx2="http://schemas.microsoft.com/office/drawing/2015/10/21/chartex" xmlns:cx3="http://schemas.microsoft.com/office/drawing/2016/5/9/chartex" xmlns:cx4="http://schemas.microsoft.com/office/drawing/2016/5/10/chartex" xmlns:cx5="http://schemas.microsoft.com/office/drawing/2016/5/11/chartex" xmlns:cx6="http://schemas.microsoft.com/office/drawing/2016/5/12/chartex" xmlns:cx7="http://schemas.microsoft.com/office/drawing/2016/5/13/chartex" xmlns:cx8="http://schemas.microsoft.com/office/drawing/2016/5/14/chartex" xmlns:mc="http://schemas.openxmlformats.org/markup-compatibility/2006" xmlns:aink="http://schemas.microsoft.com/office/drawing/2016/ink" xmlns:am3d="http://schemas.microsoft.com/office/drawing/2017/model3d" xmlns:o="urn:schemas-microsoft-com:office:office" xmlns:oel="http://schemas.microsoft.com/office/2019/extlst" xmlns:r="http://schemas.openxmlformats.org/officeDocument/2006/relationships" xmlns:m="http://schemas.openxmlformats.org/officeDocument/2006/math" xmlns:v="urn:schemas-microsoft-com:vml" xmlns:wp14="http://schemas.microsoft.com/office/word/2010/wordprocessingDrawing" xmlns:wp="http://schemas.openxmlformats.org/drawingml/2006/wordprocessingDrawing" xmlns:w10="urn:schemas-microsoft-com:office:word" xmlns:w="http://schemas.openxmlformats.org/wordprocessingml/2006/main" xmlns:w14="http://schemas.microsoft.com/office/word/2010/wordml" xmlns:w15="http://schemas.microsoft.com/office/word/2012/wordml" xmlns:w16cex="http://schemas.microsoft.com/office/word/2018/wordml/cex" xmlns:w16cid="http://schemas.microsoft.com/office/word/2016/wordml/cid" xmlns:w16="http://schemas.microsoft.com/office/word/2018/wordml" xmlns:w16du="http://schemas.microsoft.com/office/word/2023/wordml/word16du" xmlns:w16sdtdh="http://schemas.microsoft.com/office/word/2020/wordml/sdtdatahash" xmlns:w16sdtfl="http://schemas.microsoft.com/office/word/2024/wordml/sdtformatlock" xmlns:w16se="http://schemas.microsoft.com/office/word/2015/wordml/symex" xmlns:wpg="http://schemas.microsoft.com/office/word/2010/wordprocessingGroup" xmlns:wpi="http://schemas.microsoft.com/office/word/2010/wordprocessingInk" xmlns:wne="http://schemas.microsoft.com/office/word/2006/wordml" xmlns:wps="http://schemas.microsoft.com/office/word/2010/wordprocessingShape" mc:Ignorable="w14 w15 w16se w16cid w16 w16cex w16sdtdh w16sdtfl w16du wp14">
   <w:body>
     <w:p>
       <w:pPr>
@@ -120,10 +120,9 @@
           <w:bCs/>
           <w:sz w:val="32"/>
           <w:szCs w:val="32"/>
-          <w:highlight w:val="red"/>
           <w:u w:val="single"/>
         </w:rPr>
-        <w:t>?????</w:t>
+        <w:t>31st Aug 2026</w:t>
       </w:r>
     </w:p>
     <w:p>
@@ -2571,6 +2570,42 @@
         </w:tc>
       </w:tr>
     </w:tbl>
+    <w:p>
+      <w:pPr>
+        <w:spacing w:before="0" w:line="240" w:lineRule="auto"/>
+        <w:jc w:val="center"/>
+        <w:rPr>
+          <w:b/>
+          <w:bCs/>
+          <w:sz w:val="32"/>
+          <w:szCs w:val="32"/>
+          <w:u w:val="single"/>
+        </w:rPr>
+      </w:pPr>
+    </w:p>
+    <w:p>
+      <w:pPr>
+        <w:spacing w:before="0" w:line="240" w:lineRule="auto"/>
+        <w:jc w:val="center"/>
+        <w:rPr>
+          <w:b/>
+          <w:bCs/>
+          <w:sz w:val="32"/>
+          <w:szCs w:val="32"/>
+          <w:u w:val="single"/>
+        </w:rPr>
+      </w:pPr>
+      <w:r>
+        <w:rPr>
+          <w:b/>
+          <w:bCs/>
+          <w:sz w:val="32"/>
+          <w:szCs w:val="32"/>
+          <w:u w:val="single"/>
+        </w:rPr>
+        <w:t>========</w:t>
+      </w:r>
+    </w:p>
     <w:p>
       <w:pPr>
         <w:spacing w:before="0" w:line="240" w:lineRule="auto"/>
@@ -2630,6 +2665,7 @@
           <w:szCs w:val="32"/>
           <w:u w:val="single"/>
         </w:rPr>
+        <w:lastRenderedPageBreak/>
         <w:t xml:space="preserve">TS </w:t>
       </w:r>
       <w:r>
@@ -2863,7 +2899,6 @@
                 <w:sz w:val="32"/>
                 <w:szCs w:val="32"/>
               </w:rPr>
-              <w:lastRenderedPageBreak/>
               <w:t>As Printed</w:t>
             </w:r>
           </w:p>
@@ -6304,99 +6339,84 @@
               <w:adjustRightInd w:val="0"/>
               <w:spacing w:before="0" w:line="240" w:lineRule="auto"/>
               <w:rPr>
-                <w:rFonts w:ascii="BRH Malayalam Extra" w:hAnsi="BRH Malayalam Extra" w:cs="BRH Malayalam Extra"/>
-                <w:color w:val="000000"/>
-                <w:sz w:val="32"/>
-                <w:szCs w:val="32"/>
-              </w:rPr>
-            </w:pPr>
-            <w:r>
-              <w:rPr>
-                <w:rFonts w:ascii="BRH Malayalam Extra" w:hAnsi="BRH Malayalam Extra" w:cs="BRH Malayalam Extra"/>
-                <w:color w:val="000000"/>
-                <w:sz w:val="32"/>
-                <w:szCs w:val="32"/>
-              </w:rPr>
-              <w:t>s</w:t>
-            </w:r>
-            <w:r>
-              <w:rPr>
-                <w:rFonts w:ascii="BRH Malayalam Extra" w:hAnsi="BRH Malayalam Extra" w:cs="BRH Malayalam Extra"/>
-                <w:color w:val="000000"/>
-                <w:sz w:val="26"/>
-                <w:szCs w:val="32"/>
-              </w:rPr>
-              <w:t>–</w:t>
-            </w:r>
-            <w:r>
-              <w:rPr>
-                <w:rFonts w:ascii="BRH Malayalam Extra" w:hAnsi="BRH Malayalam Extra" w:cs="BRH Malayalam Extra"/>
-                <w:color w:val="000000"/>
-                <w:sz w:val="32"/>
-                <w:szCs w:val="32"/>
-              </w:rPr>
-              <w:t>i</w:t>
-            </w:r>
-            <w:r>
-              <w:rPr>
-                <w:rFonts w:ascii="BRH Malayalam Extra" w:hAnsi="BRH Malayalam Extra" w:cs="BRH Malayalam Extra"/>
-                <w:color w:val="000000"/>
-                <w:sz w:val="32"/>
-                <w:szCs w:val="32"/>
-                <w:highlight w:val="yellow"/>
-              </w:rPr>
-              <w:t>b§</w:t>
-            </w:r>
-            <w:r>
-              <w:rPr>
-                <w:rFonts w:ascii="BRH Malayalam Extra" w:hAnsi="BRH Malayalam Extra" w:cs="BRH Malayalam Extra"/>
-                <w:color w:val="000000"/>
-                <w:sz w:val="32"/>
-                <w:szCs w:val="32"/>
-                <w:highlight w:val="yellow"/>
-              </w:rPr>
-              <w:t>ªc¡—</w:t>
-            </w:r>
-            <w:r>
-              <w:rPr>
-                <w:rFonts w:ascii="BRH Malayalam Extra" w:hAnsi="BRH Malayalam Extra" w:cs="BRH Malayalam Extra"/>
-                <w:color w:val="000000"/>
-                <w:sz w:val="32"/>
-                <w:szCs w:val="32"/>
-              </w:rPr>
-              <w:t>K</w:t>
-            </w:r>
-            <w:r>
-              <w:rPr>
-                <w:rFonts w:ascii="BRH Malayalam Extra" w:hAnsi="BRH Malayalam Extra" w:cs="BRH Malayalam Extra"/>
-                <w:color w:val="000000"/>
-                <w:sz w:val="26"/>
-                <w:szCs w:val="32"/>
-              </w:rPr>
-              <w:t>–</w:t>
-            </w:r>
-            <w:r>
-              <w:rPr>
-                <w:rFonts w:ascii="BRH Malayalam Extra" w:hAnsi="BRH Malayalam Extra" w:cs="BRH Malayalam Extra"/>
-                <w:color w:val="000000"/>
-                <w:sz w:val="32"/>
-                <w:szCs w:val="32"/>
-              </w:rPr>
-              <w:t xml:space="preserve">iyZy— sI - AªÆ¡—KI | </w:t>
-            </w:r>
-          </w:p>
-          <w:p>
-            <w:pPr>
-              <w:widowControl w:val="0"/>
-              <w:autoSpaceDE w:val="0"/>
-              <w:autoSpaceDN w:val="0"/>
-              <w:adjustRightInd w:val="0"/>
-              <w:spacing w:before="0" w:line="240" w:lineRule="auto"/>
-              <w:rPr>
                 <w:rFonts w:cs="BRH Malayalam Extra"/>
                 <w:szCs w:val="40"/>
               </w:rPr>
             </w:pPr>
+            <w:r>
+              <w:rPr>
+                <w:rFonts w:ascii="BRH Malayalam Extra" w:hAnsi="BRH Malayalam Extra" w:cs="BRH Malayalam Extra"/>
+                <w:color w:val="000000"/>
+                <w:sz w:val="32"/>
+                <w:szCs w:val="32"/>
+              </w:rPr>
+              <w:t>s</w:t>
+            </w:r>
+            <w:r>
+              <w:rPr>
+                <w:rFonts w:ascii="BRH Malayalam Extra" w:hAnsi="BRH Malayalam Extra" w:cs="BRH Malayalam Extra"/>
+                <w:color w:val="000000"/>
+                <w:sz w:val="26"/>
+                <w:szCs w:val="32"/>
+              </w:rPr>
+              <w:t>–</w:t>
+            </w:r>
+            <w:r>
+              <w:rPr>
+                <w:rFonts w:ascii="BRH Malayalam Extra" w:hAnsi="BRH Malayalam Extra" w:cs="BRH Malayalam Extra"/>
+                <w:color w:val="000000"/>
+                <w:sz w:val="32"/>
+                <w:szCs w:val="32"/>
+              </w:rPr>
+              <w:t>i</w:t>
+            </w:r>
+            <w:r>
+              <w:rPr>
+                <w:rFonts w:ascii="BRH Malayalam Extra" w:hAnsi="BRH Malayalam Extra" w:cs="BRH Malayalam Extra"/>
+                <w:color w:val="000000"/>
+                <w:sz w:val="32"/>
+                <w:szCs w:val="32"/>
+                <w:highlight w:val="yellow"/>
+              </w:rPr>
+              <w:t>b§</w:t>
+            </w:r>
+            <w:r>
+              <w:rPr>
+                <w:rFonts w:ascii="BRH Malayalam Extra" w:hAnsi="BRH Malayalam Extra" w:cs="BRH Malayalam Extra"/>
+                <w:color w:val="000000"/>
+                <w:sz w:val="32"/>
+                <w:szCs w:val="32"/>
+                <w:highlight w:val="yellow"/>
+              </w:rPr>
+              <w:t>ªc¡—</w:t>
+            </w:r>
+            <w:r>
+              <w:rPr>
+                <w:rFonts w:ascii="BRH Malayalam Extra" w:hAnsi="BRH Malayalam Extra" w:cs="BRH Malayalam Extra"/>
+                <w:color w:val="000000"/>
+                <w:sz w:val="32"/>
+                <w:szCs w:val="32"/>
+              </w:rPr>
+              <w:t>K</w:t>
+            </w:r>
+            <w:r>
+              <w:rPr>
+                <w:rFonts w:ascii="BRH Malayalam Extra" w:hAnsi="BRH Malayalam Extra" w:cs="BRH Malayalam Extra"/>
+                <w:color w:val="000000"/>
+                <w:sz w:val="26"/>
+                <w:szCs w:val="32"/>
+              </w:rPr>
+              <w:t>–</w:t>
+            </w:r>
+            <w:r>
+              <w:rPr>
+                <w:rFonts w:ascii="BRH Malayalam Extra" w:hAnsi="BRH Malayalam Extra" w:cs="BRH Malayalam Extra"/>
+                <w:color w:val="000000"/>
+                <w:sz w:val="32"/>
+                <w:szCs w:val="32"/>
+              </w:rPr>
+              <w:t xml:space="preserve">iyZy— sI - AªÆ¡—KI | </w:t>
+            </w:r>
           </w:p>
         </w:tc>
         <w:tc>
@@ -6561,89 +6581,74 @@
               <w:adjustRightInd w:val="0"/>
               <w:spacing w:before="0" w:line="240" w:lineRule="auto"/>
               <w:rPr>
-                <w:rFonts w:ascii="BRH Malayalam Extra" w:hAnsi="BRH Malayalam Extra" w:cs="BRH Malayalam Extra"/>
-                <w:color w:val="000000"/>
-                <w:sz w:val="32"/>
-                <w:szCs w:val="32"/>
-              </w:rPr>
-            </w:pPr>
-            <w:r>
-              <w:rPr>
-                <w:rFonts w:ascii="BRH Malayalam Extra" w:hAnsi="BRH Malayalam Extra" w:cs="BRH Malayalam Extra"/>
-                <w:color w:val="000000"/>
-                <w:sz w:val="32"/>
-                <w:szCs w:val="32"/>
-              </w:rPr>
-              <w:t>s</w:t>
-            </w:r>
-            <w:r>
-              <w:rPr>
-                <w:rFonts w:ascii="BRH Malayalam Extra" w:hAnsi="BRH Malayalam Extra" w:cs="BRH Malayalam Extra"/>
-                <w:color w:val="000000"/>
-                <w:sz w:val="26"/>
-                <w:szCs w:val="32"/>
-              </w:rPr>
-              <w:t>–</w:t>
-            </w:r>
-            <w:r>
-              <w:rPr>
-                <w:rFonts w:ascii="BRH Malayalam Extra" w:hAnsi="BRH Malayalam Extra" w:cs="BRH Malayalam Extra"/>
-                <w:color w:val="000000"/>
-                <w:sz w:val="32"/>
-                <w:szCs w:val="32"/>
-              </w:rPr>
-              <w:t>i</w:t>
-            </w:r>
-            <w:r>
-              <w:rPr>
-                <w:rFonts w:ascii="BRH Malayalam Extra" w:hAnsi="BRH Malayalam Extra" w:cs="BRH Malayalam Extra"/>
-                <w:color w:val="000000"/>
-                <w:sz w:val="32"/>
-                <w:szCs w:val="32"/>
-                <w:highlight w:val="green"/>
-              </w:rPr>
-              <w:t>ªÆ¡</w:t>
-            </w:r>
-            <w:r>
-              <w:rPr>
-                <w:rFonts w:ascii="BRH Malayalam Extra" w:hAnsi="BRH Malayalam Extra" w:cs="BRH Malayalam Extra"/>
-                <w:color w:val="000000"/>
-                <w:sz w:val="32"/>
-                <w:szCs w:val="32"/>
-              </w:rPr>
-              <w:t>—K</w:t>
-            </w:r>
-            <w:r>
-              <w:rPr>
-                <w:rFonts w:ascii="BRH Malayalam Extra" w:hAnsi="BRH Malayalam Extra" w:cs="BRH Malayalam Extra"/>
-                <w:color w:val="000000"/>
-                <w:sz w:val="26"/>
-                <w:szCs w:val="32"/>
-              </w:rPr>
-              <w:t>–</w:t>
-            </w:r>
-            <w:r>
-              <w:rPr>
-                <w:rFonts w:ascii="BRH Malayalam Extra" w:hAnsi="BRH Malayalam Extra" w:cs="BRH Malayalam Extra"/>
-                <w:color w:val="000000"/>
-                <w:sz w:val="32"/>
-                <w:szCs w:val="32"/>
-              </w:rPr>
-              <w:t xml:space="preserve">iyZy— sI - AªÆ¡—KI | </w:t>
-            </w:r>
-          </w:p>
-          <w:p>
-            <w:pPr>
-              <w:widowControl w:val="0"/>
-              <w:autoSpaceDE w:val="0"/>
-              <w:autoSpaceDN w:val="0"/>
-              <w:adjustRightInd w:val="0"/>
-              <w:spacing w:before="0" w:line="240" w:lineRule="auto"/>
-              <w:rPr>
                 <w:rFonts w:cs="BRH Malayalam Extra"/>
                 <w:szCs w:val="40"/>
               </w:rPr>
             </w:pPr>
+            <w:r>
+              <w:rPr>
+                <w:rFonts w:ascii="BRH Malayalam Extra" w:hAnsi="BRH Malayalam Extra" w:cs="BRH Malayalam Extra"/>
+                <w:color w:val="000000"/>
+                <w:sz w:val="32"/>
+                <w:szCs w:val="32"/>
+              </w:rPr>
+              <w:t>s</w:t>
+            </w:r>
+            <w:r>
+              <w:rPr>
+                <w:rFonts w:ascii="BRH Malayalam Extra" w:hAnsi="BRH Malayalam Extra" w:cs="BRH Malayalam Extra"/>
+                <w:color w:val="000000"/>
+                <w:sz w:val="26"/>
+                <w:szCs w:val="32"/>
+              </w:rPr>
+              <w:t>–</w:t>
+            </w:r>
+            <w:r>
+              <w:rPr>
+                <w:rFonts w:ascii="BRH Malayalam Extra" w:hAnsi="BRH Malayalam Extra" w:cs="BRH Malayalam Extra"/>
+                <w:color w:val="000000"/>
+                <w:sz w:val="32"/>
+                <w:szCs w:val="32"/>
+              </w:rPr>
+              <w:t>i</w:t>
+            </w:r>
+            <w:r>
+              <w:rPr>
+                <w:rFonts w:ascii="BRH Malayalam Extra" w:hAnsi="BRH Malayalam Extra" w:cs="BRH Malayalam Extra"/>
+                <w:color w:val="000000"/>
+                <w:sz w:val="32"/>
+                <w:szCs w:val="32"/>
+                <w:highlight w:val="green"/>
+              </w:rPr>
+              <w:t>ªÆ¡</w:t>
+            </w:r>
+            <w:r>
+              <w:rPr>
+                <w:rFonts w:ascii="BRH Malayalam Extra" w:hAnsi="BRH Malayalam Extra" w:cs="BRH Malayalam Extra"/>
+                <w:color w:val="000000"/>
+                <w:sz w:val="32"/>
+                <w:szCs w:val="32"/>
+              </w:rPr>
+              <w:t>—K</w:t>
+            </w:r>
+            <w:r>
+              <w:rPr>
+                <w:rFonts w:ascii="BRH Malayalam Extra" w:hAnsi="BRH Malayalam Extra" w:cs="BRH Malayalam Extra"/>
+                <w:color w:val="000000"/>
+                <w:sz w:val="26"/>
+                <w:szCs w:val="32"/>
+              </w:rPr>
+              <w:t>–</w:t>
+            </w:r>
+            <w:r>
+              <w:rPr>
+                <w:rFonts w:ascii="BRH Malayalam Extra" w:hAnsi="BRH Malayalam Extra" w:cs="BRH Malayalam Extra"/>
+                <w:color w:val="000000"/>
+                <w:sz w:val="32"/>
+                <w:szCs w:val="32"/>
+              </w:rPr>
+              <w:t xml:space="preserve">iyZy— sI - AªÆ¡—KI | </w:t>
+            </w:r>
           </w:p>
         </w:tc>
       </w:tr>
@@ -21116,7 +21121,7 @@
 </file>
 
 <file path=word/endnotes.xml><?xml version="1.0" encoding="utf-8"?>
-<w:endnotes xmlns:wpc="http://schemas.microsoft.com/office/word/2010/wordprocessingCanvas" xmlns:cx="http://schemas.microsoft.com/office/drawing/2014/chartex" xmlns:cx1="http://schemas.microsoft.com/office/drawing/2015/9/8/chartex" xmlns:cx2="http://schemas.microsoft.com/office/drawing/2015/10/21/chartex" xmlns:cx3="http://schemas.microsoft.com/office/drawing/2016/5/9/chartex" xmlns:cx4="http://schemas.microsoft.com/office/drawing/2016/5/10/chartex" xmlns:cx5="http://schemas.microsoft.com/office/drawing/2016/5/11/chartex" xmlns:cx6="http://schemas.microsoft.com/office/drawing/2016/5/12/chartex" xmlns:cx7="http://schemas.microsoft.com/office/drawing/2016/5/13/chartex" xmlns:cx8="http://schemas.microsoft.com/office/drawing/2016/5/14/chartex" xmlns:mc="http://schemas.openxmlformats.org/markup-compatibility/2006" xmlns:aink="http://schemas.microsoft.com/office/drawing/2016/ink" xmlns:am3d="http://schemas.microsoft.com/office/drawing/2017/model3d" xmlns:o="urn:schemas-microsoft-com:office:office" xmlns:oel="http://schemas.microsoft.com/office/2019/extlst" xmlns:r="http://schemas.openxmlformats.org/officeDocument/2006/relationships" xmlns:m="http://schemas.openxmlformats.org/officeDocument/2006/math" xmlns:v="urn:schemas-microsoft-com:vml" xmlns:wp14="http://schemas.microsoft.com/office/word/2010/wordprocessingDrawing" xmlns:wp="http://schemas.openxmlformats.org/drawingml/2006/wordprocessingDrawing" xmlns:w10="urn:schemas-microsoft-com:office:word" xmlns:w="http://schemas.openxmlformats.org/wordprocessingml/2006/main" xmlns:w14="http://schemas.microsoft.com/office/word/2010/wordml" xmlns:w15="http://schemas.microsoft.com/office/word/2012/wordml" xmlns:w16cei="http://schemas.microsoft.com/office/word/2026/wordml/cei" xmlns:w16cex="http://schemas.microsoft.com/office/word/2018/wordml/cex" xmlns:w16cid="http://schemas.microsoft.com/office/word/2016/wordml/cid" xmlns:w16="http://schemas.microsoft.com/office/word/2018/wordml" xmlns:w16du="http://schemas.microsoft.com/office/word/2023/wordml/word16du" xmlns:w16sdtdh="http://schemas.microsoft.com/office/word/2020/wordml/sdtdatahash" xmlns:w16sdtfl="http://schemas.microsoft.com/office/word/2024/wordml/sdtformatlock" xmlns:w16se="http://schemas.microsoft.com/office/word/2015/wordml/symex" xmlns:wpg="http://schemas.microsoft.com/office/word/2010/wordprocessingGroup" xmlns:wpi="http://schemas.microsoft.com/office/word/2010/wordprocessingInk" xmlns:wne="http://schemas.microsoft.com/office/word/2006/wordml" xmlns:wps="http://schemas.microsoft.com/office/word/2010/wordprocessingShape" mc:Ignorable="w14 w15 w16se w16cid w16 w16cex w16sdtdh w16sdtfl w16du wp14">
+<w:endnotes xmlns:wpc="http://schemas.microsoft.com/office/word/2010/wordprocessingCanvas" xmlns:cx="http://schemas.microsoft.com/office/drawing/2014/chartex" xmlns:cx1="http://schemas.microsoft.com/office/drawing/2015/9/8/chartex" xmlns:cx2="http://schemas.microsoft.com/office/drawing/2015/10/21/chartex" xmlns:cx3="http://schemas.microsoft.com/office/drawing/2016/5/9/chartex" xmlns:cx4="http://schemas.microsoft.com/office/drawing/2016/5/10/chartex" xmlns:cx5="http://schemas.microsoft.com/office/drawing/2016/5/11/chartex" xmlns:cx6="http://schemas.microsoft.com/office/drawing/2016/5/12/chartex" xmlns:cx7="http://schemas.microsoft.com/office/drawing/2016/5/13/chartex" xmlns:cx8="http://schemas.microsoft.com/office/drawing/2016/5/14/chartex" xmlns:mc="http://schemas.openxmlformats.org/markup-compatibility/2006" xmlns:aink="http://schemas.microsoft.com/office/drawing/2016/ink" xmlns:am3d="http://schemas.microsoft.com/office/drawing/2017/model3d" xmlns:o="urn:schemas-microsoft-com:office:office" xmlns:oel="http://schemas.microsoft.com/office/2019/extlst" xmlns:r="http://schemas.openxmlformats.org/officeDocument/2006/relationships" xmlns:m="http://schemas.openxmlformats.org/officeDocument/2006/math" xmlns:v="urn:schemas-microsoft-com:vml" xmlns:wp14="http://schemas.microsoft.com/office/word/2010/wordprocessingDrawing" xmlns:wp="http://schemas.openxmlformats.org/drawingml/2006/wordprocessingDrawing" xmlns:w10="urn:schemas-microsoft-com:office:word" xmlns:w="http://schemas.openxmlformats.org/wordprocessingml/2006/main" xmlns:w14="http://schemas.microsoft.com/office/word/2010/wordml" xmlns:w15="http://schemas.microsoft.com/office/word/2012/wordml" xmlns:w16cex="http://schemas.microsoft.com/office/word/2018/wordml/cex" xmlns:w16cid="http://schemas.microsoft.com/office/word/2016/wordml/cid" xmlns:w16="http://schemas.microsoft.com/office/word/2018/wordml" xmlns:w16du="http://schemas.microsoft.com/office/word/2023/wordml/word16du" xmlns:w16sdtdh="http://schemas.microsoft.com/office/word/2020/wordml/sdtdatahash" xmlns:w16sdtfl="http://schemas.microsoft.com/office/word/2024/wordml/sdtformatlock" xmlns:w16se="http://schemas.microsoft.com/office/word/2015/wordml/symex" xmlns:wpg="http://schemas.microsoft.com/office/word/2010/wordprocessingGroup" xmlns:wpi="http://schemas.microsoft.com/office/word/2010/wordprocessingInk" xmlns:wne="http://schemas.microsoft.com/office/word/2006/wordml" xmlns:wps="http://schemas.microsoft.com/office/word/2010/wordprocessingShape" mc:Ignorable="w14 w15 w16se w16cid w16 w16cex w16sdtdh w16sdtfl w16du wp14">
   <w:endnote w:type="separator" w:id="-1">
     <w:p>
       <w:pPr>
@@ -21141,7 +21146,7 @@
 </file>
 
 <file path=word/footer1.xml><?xml version="1.0" encoding="utf-8"?>
-<w:ftr xmlns:wpc="http://schemas.microsoft.com/office/word/2010/wordprocessingCanvas" xmlns:cx="http://schemas.microsoft.com/office/drawing/2014/chartex" xmlns:cx1="http://schemas.microsoft.com/office/drawing/2015/9/8/chartex" xmlns:cx2="http://schemas.microsoft.com/office/drawing/2015/10/21/chartex" xmlns:cx3="http://schemas.microsoft.com/office/drawing/2016/5/9/chartex" xmlns:cx4="http://schemas.microsoft.com/office/drawing/2016/5/10/chartex" xmlns:cx5="http://schemas.microsoft.com/office/drawing/2016/5/11/chartex" xmlns:cx6="http://schemas.microsoft.com/office/drawing/2016/5/12/chartex" xmlns:cx7="http://schemas.microsoft.com/office/drawing/2016/5/13/chartex" xmlns:cx8="http://schemas.microsoft.com/office/drawing/2016/5/14/chartex" xmlns:mc="http://schemas.openxmlformats.org/markup-compatibility/2006" xmlns:aink="http://schemas.microsoft.com/office/drawing/2016/ink" xmlns:am3d="http://schemas.microsoft.com/office/drawing/2017/model3d" xmlns:o="urn:schemas-microsoft-com:office:office" xmlns:oel="http://schemas.microsoft.com/office/2019/extlst" xmlns:r="http://schemas.openxmlformats.org/officeDocument/2006/relationships" xmlns:m="http://schemas.openxmlformats.org/officeDocument/2006/math" xmlns:v="urn:schemas-microsoft-com:vml" xmlns:wp14="http://schemas.microsoft.com/office/word/2010/wordprocessingDrawing" xmlns:wp="http://schemas.openxmlformats.org/drawingml/2006/wordprocessingDrawing" xmlns:w10="urn:schemas-microsoft-com:office:word" xmlns:w="http://schemas.openxmlformats.org/wordprocessingml/2006/main" xmlns:w14="http://schemas.microsoft.com/office/word/2010/wordml" xmlns:w15="http://schemas.microsoft.com/office/word/2012/wordml" xmlns:w16cei="http://schemas.microsoft.com/office/word/2026/wordml/cei" xmlns:w16cex="http://schemas.microsoft.com/office/word/2018/wordml/cex" xmlns:w16cid="http://schemas.microsoft.com/office/word/2016/wordml/cid" xmlns:w16="http://schemas.microsoft.com/office/word/2018/wordml" xmlns:w16du="http://schemas.microsoft.com/office/word/2023/wordml/word16du" xmlns:w16sdtdh="http://schemas.microsoft.com/office/word/2020/wordml/sdtdatahash" xmlns:w16sdtfl="http://schemas.microsoft.com/office/word/2024/wordml/sdtformatlock" xmlns:w16se="http://schemas.microsoft.com/office/word/2015/wordml/symex" xmlns:wpg="http://schemas.microsoft.com/office/word/2010/wordprocessingGroup" xmlns:wpi="http://schemas.microsoft.com/office/word/2010/wordprocessingInk" xmlns:wne="http://schemas.microsoft.com/office/word/2006/wordml" xmlns:wps="http://schemas.microsoft.com/office/word/2010/wordprocessingShape" mc:Ignorable="w14 w15 w16se w16cid w16 w16cex w16sdtdh w16sdtfl w16du wp14">
+<w:ftr xmlns:wpc="http://schemas.microsoft.com/office/word/2010/wordprocessingCanvas" xmlns:cx="http://schemas.microsoft.com/office/drawing/2014/chartex" xmlns:cx1="http://schemas.microsoft.com/office/drawing/2015/9/8/chartex" xmlns:cx2="http://schemas.microsoft.com/office/drawing/2015/10/21/chartex" xmlns:cx3="http://schemas.microsoft.com/office/drawing/2016/5/9/chartex" xmlns:cx4="http://schemas.microsoft.com/office/drawing/2016/5/10/chartex" xmlns:cx5="http://schemas.microsoft.com/office/drawing/2016/5/11/chartex" xmlns:cx6="http://schemas.microsoft.com/office/drawing/2016/5/12/chartex" xmlns:cx7="http://schemas.microsoft.com/office/drawing/2016/5/13/chartex" xmlns:cx8="http://schemas.microsoft.com/office/drawing/2016/5/14/chartex" xmlns:mc="http://schemas.openxmlformats.org/markup-compatibility/2006" xmlns:aink="http://schemas.microsoft.com/office/drawing/2016/ink" xmlns:am3d="http://schemas.microsoft.com/office/drawing/2017/model3d" xmlns:o="urn:schemas-microsoft-com:office:office" xmlns:oel="http://schemas.microsoft.com/office/2019/extlst" xmlns:r="http://schemas.openxmlformats.org/officeDocument/2006/relationships" xmlns:m="http://schemas.openxmlformats.org/officeDocument/2006/math" xmlns:v="urn:schemas-microsoft-com:vml" xmlns:wp14="http://schemas.microsoft.com/office/word/2010/wordprocessingDrawing" xmlns:wp="http://schemas.openxmlformats.org/drawingml/2006/wordprocessingDrawing" xmlns:w10="urn:schemas-microsoft-com:office:word" xmlns:w="http://schemas.openxmlformats.org/wordprocessingml/2006/main" xmlns:w14="http://schemas.microsoft.com/office/word/2010/wordml" xmlns:w15="http://schemas.microsoft.com/office/word/2012/wordml" xmlns:w16cex="http://schemas.microsoft.com/office/word/2018/wordml/cex" xmlns:w16cid="http://schemas.microsoft.com/office/word/2016/wordml/cid" xmlns:w16="http://schemas.microsoft.com/office/word/2018/wordml" xmlns:w16du="http://schemas.microsoft.com/office/word/2023/wordml/word16du" xmlns:w16sdtdh="http://schemas.microsoft.com/office/word/2020/wordml/sdtdatahash" xmlns:w16sdtfl="http://schemas.microsoft.com/office/word/2024/wordml/sdtformatlock" xmlns:w16se="http://schemas.microsoft.com/office/word/2015/wordml/symex" xmlns:wpg="http://schemas.microsoft.com/office/word/2010/wordprocessingGroup" xmlns:wpi="http://schemas.microsoft.com/office/word/2010/wordprocessingInk" xmlns:wne="http://schemas.microsoft.com/office/word/2006/wordml" xmlns:wps="http://schemas.microsoft.com/office/word/2010/wordprocessingShape" mc:Ignorable="w14 w15 w16se w16cid w16 w16cex w16sdtdh w16sdtfl w16du wp14">
   <w:p>
     <w:pPr>
       <w:pBdr>
@@ -21323,7 +21328,7 @@
 </file>
 
 <file path=word/footer2.xml><?xml version="1.0" encoding="utf-8"?>
-<w:ftr xmlns:wpc="http://schemas.microsoft.com/office/word/2010/wordprocessingCanvas" xmlns:cx="http://schemas.microsoft.com/office/drawing/2014/chartex" xmlns:cx1="http://schemas.microsoft.com/office/drawing/2015/9/8/chartex" xmlns:cx2="http://schemas.microsoft.com/office/drawing/2015/10/21/chartex" xmlns:cx3="http://schemas.microsoft.com/office/drawing/2016/5/9/chartex" xmlns:cx4="http://schemas.microsoft.com/office/drawing/2016/5/10/chartex" xmlns:cx5="http://schemas.microsoft.com/office/drawing/2016/5/11/chartex" xmlns:cx6="http://schemas.microsoft.com/office/drawing/2016/5/12/chartex" xmlns:cx7="http://schemas.microsoft.com/office/drawing/2016/5/13/chartex" xmlns:cx8="http://schemas.microsoft.com/office/drawing/2016/5/14/chartex" xmlns:mc="http://schemas.openxmlformats.org/markup-compatibility/2006" xmlns:aink="http://schemas.microsoft.com/office/drawing/2016/ink" xmlns:am3d="http://schemas.microsoft.com/office/drawing/2017/model3d" xmlns:o="urn:schemas-microsoft-com:office:office" xmlns:oel="http://schemas.microsoft.com/office/2019/extlst" xmlns:r="http://schemas.openxmlformats.org/officeDocument/2006/relationships" xmlns:m="http://schemas.openxmlformats.org/officeDocument/2006/math" xmlns:v="urn:schemas-microsoft-com:vml" xmlns:wp14="http://schemas.microsoft.com/office/word/2010/wordprocessingDrawing" xmlns:wp="http://schemas.openxmlformats.org/drawingml/2006/wordprocessingDrawing" xmlns:w10="urn:schemas-microsoft-com:office:word" xmlns:w="http://schemas.openxmlformats.org/wordprocessingml/2006/main" xmlns:w14="http://schemas.microsoft.com/office/word/2010/wordml" xmlns:w15="http://schemas.microsoft.com/office/word/2012/wordml" xmlns:w16cei="http://schemas.microsoft.com/office/word/2026/wordml/cei" xmlns:w16cex="http://schemas.microsoft.com/office/word/2018/wordml/cex" xmlns:w16cid="http://schemas.microsoft.com/office/word/2016/wordml/cid" xmlns:w16="http://schemas.microsoft.com/office/word/2018/wordml" xmlns:w16du="http://schemas.microsoft.com/office/word/2023/wordml/word16du" xmlns:w16sdtdh="http://schemas.microsoft.com/office/word/2020/wordml/sdtdatahash" xmlns:w16sdtfl="http://schemas.microsoft.com/office/word/2024/wordml/sdtformatlock" xmlns:w16se="http://schemas.microsoft.com/office/word/2015/wordml/symex" xmlns:wpg="http://schemas.microsoft.com/office/word/2010/wordprocessingGroup" xmlns:wpi="http://schemas.microsoft.com/office/word/2010/wordprocessingInk" xmlns:wne="http://schemas.microsoft.com/office/word/2006/wordml" xmlns:wps="http://schemas.microsoft.com/office/word/2010/wordprocessingShape" mc:Ignorable="w14 w15 w16se w16cid w16 w16cex w16sdtdh w16sdtfl w16du wp14">
+<w:ftr xmlns:wpc="http://schemas.microsoft.com/office/word/2010/wordprocessingCanvas" xmlns:cx="http://schemas.microsoft.com/office/drawing/2014/chartex" xmlns:cx1="http://schemas.microsoft.com/office/drawing/2015/9/8/chartex" xmlns:cx2="http://schemas.microsoft.com/office/drawing/2015/10/21/chartex" xmlns:cx3="http://schemas.microsoft.com/office/drawing/2016/5/9/chartex" xmlns:cx4="http://schemas.microsoft.com/office/drawing/2016/5/10/chartex" xmlns:cx5="http://schemas.microsoft.com/office/drawing/2016/5/11/chartex" xmlns:cx6="http://schemas.microsoft.com/office/drawing/2016/5/12/chartex" xmlns:cx7="http://schemas.microsoft.com/office/drawing/2016/5/13/chartex" xmlns:cx8="http://schemas.microsoft.com/office/drawing/2016/5/14/chartex" xmlns:mc="http://schemas.openxmlformats.org/markup-compatibility/2006" xmlns:aink="http://schemas.microsoft.com/office/drawing/2016/ink" xmlns:am3d="http://schemas.microsoft.com/office/drawing/2017/model3d" xmlns:o="urn:schemas-microsoft-com:office:office" xmlns:oel="http://schemas.microsoft.com/office/2019/extlst" xmlns:r="http://schemas.openxmlformats.org/officeDocument/2006/relationships" xmlns:m="http://schemas.openxmlformats.org/officeDocument/2006/math" xmlns:v="urn:schemas-microsoft-com:vml" xmlns:wp14="http://schemas.microsoft.com/office/word/2010/wordprocessingDrawing" xmlns:wp="http://schemas.openxmlformats.org/drawingml/2006/wordprocessingDrawing" xmlns:w10="urn:schemas-microsoft-com:office:word" xmlns:w="http://schemas.openxmlformats.org/wordprocessingml/2006/main" xmlns:w14="http://schemas.microsoft.com/office/word/2010/wordml" xmlns:w15="http://schemas.microsoft.com/office/word/2012/wordml" xmlns:w16cex="http://schemas.microsoft.com/office/word/2018/wordml/cex" xmlns:w16cid="http://schemas.microsoft.com/office/word/2016/wordml/cid" xmlns:w16="http://schemas.microsoft.com/office/word/2018/wordml" xmlns:w16du="http://schemas.microsoft.com/office/word/2023/wordml/word16du" xmlns:w16sdtdh="http://schemas.microsoft.com/office/word/2020/wordml/sdtdatahash" xmlns:w16sdtfl="http://schemas.microsoft.com/office/word/2024/wordml/sdtformatlock" xmlns:w16se="http://schemas.microsoft.com/office/word/2015/wordml/symex" xmlns:wpg="http://schemas.microsoft.com/office/word/2010/wordprocessingGroup" xmlns:wpi="http://schemas.microsoft.com/office/word/2010/wordprocessingInk" xmlns:wne="http://schemas.microsoft.com/office/word/2006/wordml" xmlns:wps="http://schemas.microsoft.com/office/word/2010/wordprocessingShape" mc:Ignorable="w14 w15 w16se w16cid w16 w16cex w16sdtdh w16sdtfl w16du wp14">
   <w:p>
     <w:pPr>
       <w:pBdr>
@@ -21529,7 +21534,7 @@
 </file>
 
 <file path=word/footnotes.xml><?xml version="1.0" encoding="utf-8"?>
-<w:footnotes xmlns:wpc="http://schemas.microsoft.com/office/word/2010/wordprocessingCanvas" xmlns:cx="http://schemas.microsoft.com/office/drawing/2014/chartex" xmlns:cx1="http://schemas.microsoft.com/office/drawing/2015/9/8/chartex" xmlns:cx2="http://schemas.microsoft.com/office/drawing/2015/10/21/chartex" xmlns:cx3="http://schemas.microsoft.com/office/drawing/2016/5/9/chartex" xmlns:cx4="http://schemas.microsoft.com/office/drawing/2016/5/10/chartex" xmlns:cx5="http://schemas.microsoft.com/office/drawing/2016/5/11/chartex" xmlns:cx6="http://schemas.microsoft.com/office/drawing/2016/5/12/chartex" xmlns:cx7="http://schemas.microsoft.com/office/drawing/2016/5/13/chartex" xmlns:cx8="http://schemas.microsoft.com/office/drawing/2016/5/14/chartex" xmlns:mc="http://schemas.openxmlformats.org/markup-compatibility/2006" xmlns:aink="http://schemas.microsoft.com/office/drawing/2016/ink" xmlns:am3d="http://schemas.microsoft.com/office/drawing/2017/model3d" xmlns:o="urn:schemas-microsoft-com:office:office" xmlns:oel="http://schemas.microsoft.com/office/2019/extlst" xmlns:r="http://schemas.openxmlformats.org/officeDocument/2006/relationships" xmlns:m="http://schemas.openxmlformats.org/officeDocument/2006/math" xmlns:v="urn:schemas-microsoft-com:vml" xmlns:wp14="http://schemas.microsoft.com/office/word/2010/wordprocessingDrawing" xmlns:wp="http://schemas.openxmlformats.org/drawingml/2006/wordprocessingDrawing" xmlns:w10="urn:schemas-microsoft-com:office:word" xmlns:w="http://schemas.openxmlformats.org/wordprocessingml/2006/main" xmlns:w14="http://schemas.microsoft.com/office/word/2010/wordml" xmlns:w15="http://schemas.microsoft.com/office/word/2012/wordml" xmlns:w16cei="http://schemas.microsoft.com/office/word/2026/wordml/cei" xmlns:w16cex="http://schemas.microsoft.com/office/word/2018/wordml/cex" xmlns:w16cid="http://schemas.microsoft.com/office/word/2016/wordml/cid" xmlns:w16="http://schemas.microsoft.com/office/word/2018/wordml" xmlns:w16du="http://schemas.microsoft.com/office/word/2023/wordml/word16du" xmlns:w16sdtdh="http://schemas.microsoft.com/office/word/2020/wordml/sdtdatahash" xmlns:w16sdtfl="http://schemas.microsoft.com/office/word/2024/wordml/sdtformatlock" xmlns:w16se="http://schemas.microsoft.com/office/word/2015/wordml/symex" xmlns:wpg="http://schemas.microsoft.com/office/word/2010/wordprocessingGroup" xmlns:wpi="http://schemas.microsoft.com/office/word/2010/wordprocessingInk" xmlns:wne="http://schemas.microsoft.com/office/word/2006/wordml" xmlns:wps="http://schemas.microsoft.com/office/word/2010/wordprocessingShape" mc:Ignorable="w14 w15 w16se w16cid w16 w16cex w16sdtdh w16sdtfl w16du wp14">
+<w:footnotes xmlns:wpc="http://schemas.microsoft.com/office/word/2010/wordprocessingCanvas" xmlns:cx="http://schemas.microsoft.com/office/drawing/2014/chartex" xmlns:cx1="http://schemas.microsoft.com/office/drawing/2015/9/8/chartex" xmlns:cx2="http://schemas.microsoft.com/office/drawing/2015/10/21/chartex" xmlns:cx3="http://schemas.microsoft.com/office/drawing/2016/5/9/chartex" xmlns:cx4="http://schemas.microsoft.com/office/drawing/2016/5/10/chartex" xmlns:cx5="http://schemas.microsoft.com/office/drawing/2016/5/11/chartex" xmlns:cx6="http://schemas.microsoft.com/office/drawing/2016/5/12/chartex" xmlns:cx7="http://schemas.microsoft.com/office/drawing/2016/5/13/chartex" xmlns:cx8="http://schemas.microsoft.com/office/drawing/2016/5/14/chartex" xmlns:mc="http://schemas.openxmlformats.org/markup-compatibility/2006" xmlns:aink="http://schemas.microsoft.com/office/drawing/2016/ink" xmlns:am3d="http://schemas.microsoft.com/office/drawing/2017/model3d" xmlns:o="urn:schemas-microsoft-com:office:office" xmlns:oel="http://schemas.microsoft.com/office/2019/extlst" xmlns:r="http://schemas.openxmlformats.org/officeDocument/2006/relationships" xmlns:m="http://schemas.openxmlformats.org/officeDocument/2006/math" xmlns:v="urn:schemas-microsoft-com:vml" xmlns:wp14="http://schemas.microsoft.com/office/word/2010/wordprocessingDrawing" xmlns:wp="http://schemas.openxmlformats.org/drawingml/2006/wordprocessingDrawing" xmlns:w10="urn:schemas-microsoft-com:office:word" xmlns:w="http://schemas.openxmlformats.org/wordprocessingml/2006/main" xmlns:w14="http://schemas.microsoft.com/office/word/2010/wordml" xmlns:w15="http://schemas.microsoft.com/office/word/2012/wordml" xmlns:w16cex="http://schemas.microsoft.com/office/word/2018/wordml/cex" xmlns:w16cid="http://schemas.microsoft.com/office/word/2016/wordml/cid" xmlns:w16="http://schemas.microsoft.com/office/word/2018/wordml" xmlns:w16du="http://schemas.microsoft.com/office/word/2023/wordml/word16du" xmlns:w16sdtdh="http://schemas.microsoft.com/office/word/2020/wordml/sdtdatahash" xmlns:w16sdtfl="http://schemas.microsoft.com/office/word/2024/wordml/sdtformatlock" xmlns:w16se="http://schemas.microsoft.com/office/word/2015/wordml/symex" xmlns:wpg="http://schemas.microsoft.com/office/word/2010/wordprocessingGroup" xmlns:wpi="http://schemas.microsoft.com/office/word/2010/wordprocessingInk" xmlns:wne="http://schemas.microsoft.com/office/word/2006/wordml" xmlns:wps="http://schemas.microsoft.com/office/word/2010/wordprocessingShape" mc:Ignorable="w14 w15 w16se w16cid w16 w16cex w16sdtdh w16sdtfl w16du wp14">
   <w:footnote w:type="separator" w:id="-1">
     <w:p>
       <w:pPr>
@@ -21554,7 +21559,7 @@
 </file>
 
 <file path=word/header1.xml><?xml version="1.0" encoding="utf-8"?>
-<w:hdr xmlns:wpc="http://schemas.microsoft.com/office/word/2010/wordprocessingCanvas" xmlns:cx="http://schemas.microsoft.com/office/drawing/2014/chartex" xmlns:cx1="http://schemas.microsoft.com/office/drawing/2015/9/8/chartex" xmlns:cx2="http://schemas.microsoft.com/office/drawing/2015/10/21/chartex" xmlns:cx3="http://schemas.microsoft.com/office/drawing/2016/5/9/chartex" xmlns:cx4="http://schemas.microsoft.com/office/drawing/2016/5/10/chartex" xmlns:cx5="http://schemas.microsoft.com/office/drawing/2016/5/11/chartex" xmlns:cx6="http://schemas.microsoft.com/office/drawing/2016/5/12/chartex" xmlns:cx7="http://schemas.microsoft.com/office/drawing/2016/5/13/chartex" xmlns:cx8="http://schemas.microsoft.com/office/drawing/2016/5/14/chartex" xmlns:mc="http://schemas.openxmlformats.org/markup-compatibility/2006" xmlns:aink="http://schemas.microsoft.com/office/drawing/2016/ink" xmlns:am3d="http://schemas.microsoft.com/office/drawing/2017/model3d" xmlns:o="urn:schemas-microsoft-com:office:office" xmlns:oel="http://schemas.microsoft.com/office/2019/extlst" xmlns:r="http://schemas.openxmlformats.org/officeDocument/2006/relationships" xmlns:m="http://schemas.openxmlformats.org/officeDocument/2006/math" xmlns:v="urn:schemas-microsoft-com:vml" xmlns:wp14="http://schemas.microsoft.com/office/word/2010/wordprocessingDrawing" xmlns:wp="http://schemas.openxmlformats.org/drawingml/2006/wordprocessingDrawing" xmlns:w10="urn:schemas-microsoft-com:office:word" xmlns:w="http://schemas.openxmlformats.org/wordprocessingml/2006/main" xmlns:w14="http://schemas.microsoft.com/office/word/2010/wordml" xmlns:w15="http://schemas.microsoft.com/office/word/2012/wordml" xmlns:w16cei="http://schemas.microsoft.com/office/word/2026/wordml/cei" xmlns:w16cex="http://schemas.microsoft.com/office/word/2018/wordml/cex" xmlns:w16cid="http://schemas.microsoft.com/office/word/2016/wordml/cid" xmlns:w16="http://schemas.microsoft.com/office/word/2018/wordml" xmlns:w16du="http://schemas.microsoft.com/office/word/2023/wordml/word16du" xmlns:w16sdtdh="http://schemas.microsoft.com/office/word/2020/wordml/sdtdatahash" xmlns:w16sdtfl="http://schemas.microsoft.com/office/word/2024/wordml/sdtformatlock" xmlns:w16se="http://schemas.microsoft.com/office/word/2015/wordml/symex" xmlns:wpg="http://schemas.microsoft.com/office/word/2010/wordprocessingGroup" xmlns:wpi="http://schemas.microsoft.com/office/word/2010/wordprocessingInk" xmlns:wne="http://schemas.microsoft.com/office/word/2006/wordml" xmlns:wps="http://schemas.microsoft.com/office/word/2010/wordprocessingShape" mc:Ignorable="w14 w15 w16se w16cid w16 w16cex w16sdtdh w16sdtfl w16du wp14">
+<w:hdr xmlns:wpc="http://schemas.microsoft.com/office/word/2010/wordprocessingCanvas" xmlns:cx="http://schemas.microsoft.com/office/drawing/2014/chartex" xmlns:cx1="http://schemas.microsoft.com/office/drawing/2015/9/8/chartex" xmlns:cx2="http://schemas.microsoft.com/office/drawing/2015/10/21/chartex" xmlns:cx3="http://schemas.microsoft.com/office/drawing/2016/5/9/chartex" xmlns:cx4="http://schemas.microsoft.com/office/drawing/2016/5/10/chartex" xmlns:cx5="http://schemas.microsoft.com/office/drawing/2016/5/11/chartex" xmlns:cx6="http://schemas.microsoft.com/office/drawing/2016/5/12/chartex" xmlns:cx7="http://schemas.microsoft.com/office/drawing/2016/5/13/chartex" xmlns:cx8="http://schemas.microsoft.com/office/drawing/2016/5/14/chartex" xmlns:mc="http://schemas.openxmlformats.org/markup-compatibility/2006" xmlns:aink="http://schemas.microsoft.com/office/drawing/2016/ink" xmlns:am3d="http://schemas.microsoft.com/office/drawing/2017/model3d" xmlns:o="urn:schemas-microsoft-com:office:office" xmlns:oel="http://schemas.microsoft.com/office/2019/extlst" xmlns:r="http://schemas.openxmlformats.org/officeDocument/2006/relationships" xmlns:m="http://schemas.openxmlformats.org/officeDocument/2006/math" xmlns:v="urn:schemas-microsoft-com:vml" xmlns:wp14="http://schemas.microsoft.com/office/word/2010/wordprocessingDrawing" xmlns:wp="http://schemas.openxmlformats.org/drawingml/2006/wordprocessingDrawing" xmlns:w10="urn:schemas-microsoft-com:office:word" xmlns:w="http://schemas.openxmlformats.org/wordprocessingml/2006/main" xmlns:w14="http://schemas.microsoft.com/office/word/2010/wordml" xmlns:w15="http://schemas.microsoft.com/office/word/2012/wordml" xmlns:w16cex="http://schemas.microsoft.com/office/word/2018/wordml/cex" xmlns:w16cid="http://schemas.microsoft.com/office/word/2016/wordml/cid" xmlns:w16="http://schemas.microsoft.com/office/word/2018/wordml" xmlns:w16du="http://schemas.microsoft.com/office/word/2023/wordml/word16du" xmlns:w16sdtdh="http://schemas.microsoft.com/office/word/2020/wordml/sdtdatahash" xmlns:w16sdtfl="http://schemas.microsoft.com/office/word/2024/wordml/sdtformatlock" xmlns:w16se="http://schemas.microsoft.com/office/word/2015/wordml/symex" xmlns:wpg="http://schemas.microsoft.com/office/word/2010/wordprocessingGroup" xmlns:wpi="http://schemas.microsoft.com/office/word/2010/wordprocessingInk" xmlns:wne="http://schemas.microsoft.com/office/word/2006/wordml" xmlns:wps="http://schemas.microsoft.com/office/word/2010/wordprocessingShape" mc:Ignorable="w14 w15 w16se w16cid w16 w16cex w16sdtdh w16sdtfl w16du wp14">
   <w:p>
     <w:pPr>
       <w:pStyle w:val="Header"/>
@@ -21575,7 +21580,7 @@
 </file>
 
 <file path=word/header2.xml><?xml version="1.0" encoding="utf-8"?>
-<w:hdr xmlns:wpc="http://schemas.microsoft.com/office/word/2010/wordprocessingCanvas" xmlns:cx="http://schemas.microsoft.com/office/drawing/2014/chartex" xmlns:cx1="http://schemas.microsoft.com/office/drawing/2015/9/8/chartex" xmlns:cx2="http://schemas.microsoft.com/office/drawing/2015/10/21/chartex" xmlns:cx3="http://schemas.microsoft.com/office/drawing/2016/5/9/chartex" xmlns:cx4="http://schemas.microsoft.com/office/drawing/2016/5/10/chartex" xmlns:cx5="http://schemas.microsoft.com/office/drawing/2016/5/11/chartex" xmlns:cx6="http://schemas.microsoft.com/office/drawing/2016/5/12/chartex" xmlns:cx7="http://schemas.microsoft.com/office/drawing/2016/5/13/chartex" xmlns:cx8="http://schemas.microsoft.com/office/drawing/2016/5/14/chartex" xmlns:mc="http://schemas.openxmlformats.org/markup-compatibility/2006" xmlns:aink="http://schemas.microsoft.com/office/drawing/2016/ink" xmlns:am3d="http://schemas.microsoft.com/office/drawing/2017/model3d" xmlns:o="urn:schemas-microsoft-com:office:office" xmlns:oel="http://schemas.microsoft.com/office/2019/extlst" xmlns:r="http://schemas.openxmlformats.org/officeDocument/2006/relationships" xmlns:m="http://schemas.openxmlformats.org/officeDocument/2006/math" xmlns:v="urn:schemas-microsoft-com:vml" xmlns:wp14="http://schemas.microsoft.com/office/word/2010/wordprocessingDrawing" xmlns:wp="http://schemas.openxmlformats.org/drawingml/2006/wordprocessingDrawing" xmlns:w10="urn:schemas-microsoft-com:office:word" xmlns:w="http://schemas.openxmlformats.org/wordprocessingml/2006/main" xmlns:w14="http://schemas.microsoft.com/office/word/2010/wordml" xmlns:w15="http://schemas.microsoft.com/office/word/2012/wordml" xmlns:w16cei="http://schemas.microsoft.com/office/word/2026/wordml/cei" xmlns:w16cex="http://schemas.microsoft.com/office/word/2018/wordml/cex" xmlns:w16cid="http://schemas.microsoft.com/office/word/2016/wordml/cid" xmlns:w16="http://schemas.microsoft.com/office/word/2018/wordml" xmlns:w16du="http://schemas.microsoft.com/office/word/2023/wordml/word16du" xmlns:w16sdtdh="http://schemas.microsoft.com/office/word/2020/wordml/sdtdatahash" xmlns:w16sdtfl="http://schemas.microsoft.com/office/word/2024/wordml/sdtformatlock" xmlns:w16se="http://schemas.microsoft.com/office/word/2015/wordml/symex" xmlns:wpg="http://schemas.microsoft.com/office/word/2010/wordprocessingGroup" xmlns:wpi="http://schemas.microsoft.com/office/word/2010/wordprocessingInk" xmlns:wne="http://schemas.microsoft.com/office/word/2006/wordml" xmlns:wps="http://schemas.microsoft.com/office/word/2010/wordprocessingShape" mc:Ignorable="w14 w15 w16se w16cid w16 w16cex w16sdtdh w16sdtfl w16du wp14">
+<w:hdr xmlns:wpc="http://schemas.microsoft.com/office/word/2010/wordprocessingCanvas" xmlns:cx="http://schemas.microsoft.com/office/drawing/2014/chartex" xmlns:cx1="http://schemas.microsoft.com/office/drawing/2015/9/8/chartex" xmlns:cx2="http://schemas.microsoft.com/office/drawing/2015/10/21/chartex" xmlns:cx3="http://schemas.microsoft.com/office/drawing/2016/5/9/chartex" xmlns:cx4="http://schemas.microsoft.com/office/drawing/2016/5/10/chartex" xmlns:cx5="http://schemas.microsoft.com/office/drawing/2016/5/11/chartex" xmlns:cx6="http://schemas.microsoft.com/office/drawing/2016/5/12/chartex" xmlns:cx7="http://schemas.microsoft.com/office/drawing/2016/5/13/chartex" xmlns:cx8="http://schemas.microsoft.com/office/drawing/2016/5/14/chartex" xmlns:mc="http://schemas.openxmlformats.org/markup-compatibility/2006" xmlns:aink="http://schemas.microsoft.com/office/drawing/2016/ink" xmlns:am3d="http://schemas.microsoft.com/office/drawing/2017/model3d" xmlns:o="urn:schemas-microsoft-com:office:office" xmlns:oel="http://schemas.microsoft.com/office/2019/extlst" xmlns:r="http://schemas.openxmlformats.org/officeDocument/2006/relationships" xmlns:m="http://schemas.openxmlformats.org/officeDocument/2006/math" xmlns:v="urn:schemas-microsoft-com:vml" xmlns:wp14="http://schemas.microsoft.com/office/word/2010/wordprocessingDrawing" xmlns:wp="http://schemas.openxmlformats.org/drawingml/2006/wordprocessingDrawing" xmlns:w10="urn:schemas-microsoft-com:office:word" xmlns:w="http://schemas.openxmlformats.org/wordprocessingml/2006/main" xmlns:w14="http://schemas.microsoft.com/office/word/2010/wordml" xmlns:w15="http://schemas.microsoft.com/office/word/2012/wordml" xmlns:w16cex="http://schemas.microsoft.com/office/word/2018/wordml/cex" xmlns:w16cid="http://schemas.microsoft.com/office/word/2016/wordml/cid" xmlns:w16="http://schemas.microsoft.com/office/word/2018/wordml" xmlns:w16du="http://schemas.microsoft.com/office/word/2023/wordml/word16du" xmlns:w16sdtdh="http://schemas.microsoft.com/office/word/2020/wordml/sdtdatahash" xmlns:w16sdtfl="http://schemas.microsoft.com/office/word/2024/wordml/sdtformatlock" xmlns:w16se="http://schemas.microsoft.com/office/word/2015/wordml/symex" xmlns:wpg="http://schemas.microsoft.com/office/word/2010/wordprocessingGroup" xmlns:wpi="http://schemas.microsoft.com/office/word/2010/wordprocessingInk" xmlns:wne="http://schemas.microsoft.com/office/word/2006/wordml" xmlns:wps="http://schemas.microsoft.com/office/word/2010/wordprocessingShape" mc:Ignorable="w14 w15 w16se w16cid w16 w16cex w16sdtdh w16sdtfl w16du wp14">
   <w:p>
     <w:pPr>
       <w:pStyle w:val="Header"/>

</xml_diff>